<commit_message>
gitAuto manual push @ 2026-03-22 14:38:36
</commit_message>
<xml_diff>
--- a/docs/Report/渗透测试技术实践1报告. 网工2301班-23053020134-雷若奇.docx
+++ b/docs/Report/渗透测试技术实践1报告. 网工2301班-23053020134-雷若奇.docx
@@ -366,8 +366,8 @@
       <w:r>
         <w:drawing>
           <wp:inline distT="0" distB="0" distL="114300" distR="114300">
-            <wp:extent cx="5263515" cy="3114675"/>
-            <wp:effectExtent l="0" t="0" r="13335" b="9525"/>
+            <wp:extent cx="5263515" cy="3114040"/>
+            <wp:effectExtent l="0" t="0" r="13335" b="10160"/>
             <wp:docPr id="1" name="图片 1"/>
             <wp:cNvGraphicFramePr>
               <a:graphicFrameLocks xmlns:a="http://schemas.openxmlformats.org/drawingml/2006/main" noChangeAspect="1"/>
@@ -390,7 +390,7 @@
                   <pic:spPr>
                     <a:xfrm>
                       <a:off x="0" y="0"/>
-                      <a:ext cx="5263515" cy="3114675"/>
+                      <a:ext cx="5263515" cy="3114040"/>
                     </a:xfrm>
                     <a:prstGeom prst="rect">
                       <a:avLst/>
@@ -440,8 +440,8 @@
       <w:r>
         <w:drawing>
           <wp:inline distT="0" distB="0" distL="114300" distR="114300">
-            <wp:extent cx="5263515" cy="3114675"/>
-            <wp:effectExtent l="0" t="0" r="13335" b="9525"/>
+            <wp:extent cx="5263515" cy="3114040"/>
+            <wp:effectExtent l="0" t="0" r="13335" b="10160"/>
             <wp:docPr id="2" name="图片 2"/>
             <wp:cNvGraphicFramePr>
               <a:graphicFrameLocks xmlns:a="http://schemas.openxmlformats.org/drawingml/2006/main" noChangeAspect="1"/>
@@ -464,7 +464,7 @@
                   <pic:spPr>
                     <a:xfrm>
                       <a:off x="0" y="0"/>
-                      <a:ext cx="5263515" cy="3114675"/>
+                      <a:ext cx="5263515" cy="3114040"/>
                     </a:xfrm>
                     <a:prstGeom prst="rect">
                       <a:avLst/>
@@ -516,8 +516,8 @@
       <w:r>
         <w:drawing>
           <wp:inline distT="0" distB="0" distL="114300" distR="114300">
-            <wp:extent cx="5263515" cy="3114675"/>
-            <wp:effectExtent l="0" t="0" r="13335" b="9525"/>
+            <wp:extent cx="5263515" cy="3114040"/>
+            <wp:effectExtent l="0" t="0" r="13335" b="10160"/>
             <wp:docPr id="3" name="图片 3"/>
             <wp:cNvGraphicFramePr>
               <a:graphicFrameLocks xmlns:a="http://schemas.openxmlformats.org/drawingml/2006/main" noChangeAspect="1"/>
@@ -540,7 +540,7 @@
                   <pic:spPr>
                     <a:xfrm>
                       <a:off x="0" y="0"/>
-                      <a:ext cx="5263515" cy="3114675"/>
+                      <a:ext cx="5263515" cy="3114040"/>
                     </a:xfrm>
                     <a:prstGeom prst="rect">
                       <a:avLst/>
@@ -562,8 +562,8 @@
       <w:r>
         <w:drawing>
           <wp:inline distT="0" distB="0" distL="114300" distR="114300">
-            <wp:extent cx="5263515" cy="3114675"/>
-            <wp:effectExtent l="0" t="0" r="13335" b="9525"/>
+            <wp:extent cx="5263515" cy="3114040"/>
+            <wp:effectExtent l="0" t="0" r="13335" b="10160"/>
             <wp:docPr id="4" name="图片 4"/>
             <wp:cNvGraphicFramePr>
               <a:graphicFrameLocks xmlns:a="http://schemas.openxmlformats.org/drawingml/2006/main" noChangeAspect="1"/>
@@ -586,7 +586,7 @@
                   <pic:spPr>
                     <a:xfrm>
                       <a:off x="0" y="0"/>
-                      <a:ext cx="5263515" cy="3114675"/>
+                      <a:ext cx="5263515" cy="3114040"/>
                     </a:xfrm>
                     <a:prstGeom prst="rect">
                       <a:avLst/>
@@ -610,6 +610,8 @@
           <w:szCs w:val="24"/>
         </w:rPr>
       </w:pPr>
+      <w:bookmarkStart w:id="0" w:name="_GoBack"/>
+      <w:bookmarkEnd w:id="0"/>
     </w:p>
     <w:tbl>
       <w:tblPr>
@@ -725,8 +727,6 @@
               </w:rPr>
               <w:t>的形式）</w:t>
             </w:r>
-            <w:bookmarkStart w:id="0" w:name="_GoBack"/>
-            <w:bookmarkEnd w:id="0"/>
           </w:p>
           <w:p>
             <w:pPr>

</xml_diff>